<commit_message>
docs: add deployment section with GitHub repo link to report and slides
</commit_message>
<xml_diff>
--- a/Group28_AD-HTC_Report.docx
+++ b/Group28_AD-HTC_Report.docx
@@ -153,7 +153,7 @@
         <w:pStyle w:val="ListNumber"/>
       </w:pPr>
       <w:r>
-        <w:t>12. How to Run</w:t>
+        <w:t>12. Deployment &amp; Access</w:t>
       </w:r>
     </w:p>
     <w:p>
@@ -161,7 +161,7 @@
         <w:pStyle w:val="ListNumber"/>
       </w:pPr>
       <w:r>
-        <w:t>13. Conclusion</w:t>
+        <w:t>13. How to Run</w:t>
       </w:r>
     </w:p>
     <w:p>
@@ -169,7 +169,15 @@
         <w:pStyle w:val="ListNumber"/>
       </w:pPr>
       <w:r>
-        <w:t>14. References</w:t>
+        <w:t>14. Conclusion</w:t>
+      </w:r>
+    </w:p>
+    <w:p>
+      <w:pPr>
+        <w:pStyle w:val="ListNumber"/>
+      </w:pPr>
+      <w:r>
+        <w:t>15. References</w:t>
       </w:r>
     </w:p>
     <w:p>
@@ -5110,7 +5118,417 @@
         <w:rPr>
           <w:color w:val="111111"/>
         </w:rPr>
-        <w:t>12. How to Run</w:t>
+        <w:t>12. Deployment &amp; Access</w:t>
+      </w:r>
+    </w:p>
+    <w:p>
+      <w:r>
+        <w:rPr>
+          <w:b w:val="0"/>
+          <w:i w:val="0"/>
+          <w:sz w:val="22"/>
+        </w:rPr>
+        <w:t>The complete project source code is hosted on GitHub and publicly accessible:</w:t>
+      </w:r>
+    </w:p>
+    <w:p>
+      <w:r>
+        <w:rPr>
+          <w:b/>
+          <w:i w:val="0"/>
+          <w:sz w:val="22"/>
+        </w:rPr>
+        <w:t>GitHub Repository:</w:t>
+      </w:r>
+    </w:p>
+    <w:p>
+      <w:r>
+        <w:rPr>
+          <w:b w:val="0"/>
+          <w:i w:val="0"/>
+          <w:sz w:val="22"/>
+        </w:rPr>
+        <w:t>https://github.com/hamzahdrill/GROUP-28_COURSE-PROJECT</w:t>
+      </w:r>
+    </w:p>
+    <w:p>
+      <w:r>
+        <w:rPr>
+          <w:b/>
+          <w:i w:val="0"/>
+          <w:sz w:val="22"/>
+        </w:rPr>
+        <w:t>To clone and run locally:</w:t>
+      </w:r>
+    </w:p>
+    <w:p>
+      <w:r>
+        <w:rPr>
+          <w:b w:val="0"/>
+          <w:i w:val="0"/>
+          <w:sz w:val="22"/>
+        </w:rPr>
+        <w:t xml:space="preserve">  git clone https://github.com/hamzahdrill/GROUP-28_COURSE-PROJECT.git</w:t>
+        <w:br/>
+        <w:t xml:space="preserve">  cd GROUP-28_COURSE-PROJECT</w:t>
+        <w:br/>
+        <w:t xml:space="preserve">  pip install -r requirements.txt</w:t>
+        <w:br/>
+        <w:t xml:space="preserve">  python main.py</w:t>
+        <w:br/>
+        <w:t xml:space="preserve">  # Open http://localhost:8000 in your browser</w:t>
+      </w:r>
+    </w:p>
+    <w:p>
+      <w:r>
+        <w:rPr>
+          <w:b/>
+          <w:i w:val="0"/>
+          <w:sz w:val="22"/>
+        </w:rPr>
+        <w:t>Repository contents:</w:t>
+      </w:r>
+    </w:p>
+    <w:tbl>
+      <w:tblPr>
+        <w:tblStyle w:val="TableGrid"/>
+        <w:tblW w:type="auto" w:w="0"/>
+        <w:jc w:val="center"/>
+        <w:tblLook w:firstColumn="1" w:firstRow="1" w:lastColumn="0" w:lastRow="0" w:noHBand="0" w:noVBand="1" w:val="04A0"/>
+      </w:tblPr>
+      <w:tblGrid>
+        <w:gridCol w:w="4320"/>
+        <w:gridCol w:w="4320"/>
+      </w:tblGrid>
+      <w:tr>
+        <w:tc>
+          <w:tcPr>
+            <w:tcW w:type="dxa" w:w="4320"/>
+          </w:tcPr>
+          <w:p>
+            <w:pPr>
+              <w:jc w:val="center"/>
+            </w:pPr>
+            <w:r>
+              <w:rPr>
+                <w:b/>
+                <w:sz w:val="18"/>
+              </w:rPr>
+              <w:t>File</w:t>
+            </w:r>
+          </w:p>
+        </w:tc>
+        <w:tc>
+          <w:tcPr>
+            <w:tcW w:type="dxa" w:w="4320"/>
+          </w:tcPr>
+          <w:p>
+            <w:pPr>
+              <w:jc w:val="center"/>
+            </w:pPr>
+            <w:r>
+              <w:rPr>
+                <w:b/>
+                <w:sz w:val="18"/>
+              </w:rPr>
+              <w:t>Description</w:t>
+            </w:r>
+          </w:p>
+        </w:tc>
+      </w:tr>
+      <w:tr>
+        <w:tc>
+          <w:tcPr>
+            <w:tcW w:type="dxa" w:w="4320"/>
+          </w:tcPr>
+          <w:p>
+            <w:pPr>
+              <w:jc w:val="center"/>
+            </w:pPr>
+            <w:r>
+              <w:rPr>
+                <w:sz w:val="18"/>
+              </w:rPr>
+              <w:t>main.py</w:t>
+            </w:r>
+          </w:p>
+        </w:tc>
+        <w:tc>
+          <w:tcPr>
+            <w:tcW w:type="dxa" w:w="4320"/>
+          </w:tcPr>
+          <w:p>
+            <w:pPr>
+              <w:jc w:val="center"/>
+            </w:pPr>
+            <w:r>
+              <w:rPr>
+                <w:sz w:val="18"/>
+              </w:rPr>
+              <w:t>FastAPI backend — 4 API endpoints + calculation engine</w:t>
+            </w:r>
+          </w:p>
+        </w:tc>
+      </w:tr>
+      <w:tr>
+        <w:tc>
+          <w:tcPr>
+            <w:tcW w:type="dxa" w:w="4320"/>
+          </w:tcPr>
+          <w:p>
+            <w:pPr>
+              <w:jc w:val="center"/>
+            </w:pPr>
+            <w:r>
+              <w:rPr>
+                <w:sz w:val="18"/>
+              </w:rPr>
+              <w:t>database.py</w:t>
+            </w:r>
+          </w:p>
+        </w:tc>
+        <w:tc>
+          <w:tcPr>
+            <w:tcW w:type="dxa" w:w="4320"/>
+          </w:tcPr>
+          <w:p>
+            <w:pPr>
+              <w:jc w:val="center"/>
+            </w:pPr>
+            <w:r>
+              <w:rPr>
+                <w:sz w:val="18"/>
+              </w:rPr>
+              <w:t>SQLite database — feedstocks + calculation history</w:t>
+            </w:r>
+          </w:p>
+        </w:tc>
+      </w:tr>
+      <w:tr>
+        <w:tc>
+          <w:tcPr>
+            <w:tcW w:type="dxa" w:w="4320"/>
+          </w:tcPr>
+          <w:p>
+            <w:pPr>
+              <w:jc w:val="center"/>
+            </w:pPr>
+            <w:r>
+              <w:rPr>
+                <w:sz w:val="18"/>
+              </w:rPr>
+              <w:t>models.py</w:t>
+            </w:r>
+          </w:p>
+        </w:tc>
+        <w:tc>
+          <w:tcPr>
+            <w:tcW w:type="dxa" w:w="4320"/>
+          </w:tcPr>
+          <w:p>
+            <w:pPr>
+              <w:jc w:val="center"/>
+            </w:pPr>
+            <w:r>
+              <w:rPr>
+                <w:sz w:val="18"/>
+              </w:rPr>
+              <w:t>Pydantic input/output data models</w:t>
+            </w:r>
+          </w:p>
+        </w:tc>
+      </w:tr>
+      <w:tr>
+        <w:tc>
+          <w:tcPr>
+            <w:tcW w:type="dxa" w:w="4320"/>
+          </w:tcPr>
+          <w:p>
+            <w:pPr>
+              <w:jc w:val="center"/>
+            </w:pPr>
+            <w:r>
+              <w:rPr>
+                <w:sz w:val="18"/>
+              </w:rPr>
+              <w:t>ad-htc-biomass-v2.html</w:t>
+            </w:r>
+          </w:p>
+        </w:tc>
+        <w:tc>
+          <w:tcPr>
+            <w:tcW w:type="dxa" w:w="4320"/>
+          </w:tcPr>
+          <w:p>
+            <w:pPr>
+              <w:jc w:val="center"/>
+            </w:pPr>
+            <w:r>
+              <w:rPr>
+                <w:sz w:val="18"/>
+              </w:rPr>
+              <w:t>Interactive frontend dashboard</w:t>
+            </w:r>
+          </w:p>
+        </w:tc>
+      </w:tr>
+      <w:tr>
+        <w:tc>
+          <w:tcPr>
+            <w:tcW w:type="dxa" w:w="4320"/>
+          </w:tcPr>
+          <w:p>
+            <w:pPr>
+              <w:jc w:val="center"/>
+            </w:pPr>
+            <w:r>
+              <w:rPr>
+                <w:sz w:val="18"/>
+              </w:rPr>
+              <w:t>requirements.txt</w:t>
+            </w:r>
+          </w:p>
+        </w:tc>
+        <w:tc>
+          <w:tcPr>
+            <w:tcW w:type="dxa" w:w="4320"/>
+          </w:tcPr>
+          <w:p>
+            <w:pPr>
+              <w:jc w:val="center"/>
+            </w:pPr>
+            <w:r>
+              <w:rPr>
+                <w:sz w:val="18"/>
+              </w:rPr>
+              <w:t>Python dependencies</w:t>
+            </w:r>
+          </w:p>
+        </w:tc>
+      </w:tr>
+      <w:tr>
+        <w:tc>
+          <w:tcPr>
+            <w:tcW w:type="dxa" w:w="4320"/>
+          </w:tcPr>
+          <w:p>
+            <w:pPr>
+              <w:jc w:val="center"/>
+            </w:pPr>
+            <w:r>
+              <w:rPr>
+                <w:sz w:val="18"/>
+              </w:rPr>
+              <w:t>generate_slides.py</w:t>
+            </w:r>
+          </w:p>
+        </w:tc>
+        <w:tc>
+          <w:tcPr>
+            <w:tcW w:type="dxa" w:w="4320"/>
+          </w:tcPr>
+          <w:p>
+            <w:pPr>
+              <w:jc w:val="center"/>
+            </w:pPr>
+            <w:r>
+              <w:rPr>
+                <w:sz w:val="18"/>
+              </w:rPr>
+              <w:t>PowerPoint presentation generator</w:t>
+            </w:r>
+          </w:p>
+        </w:tc>
+      </w:tr>
+      <w:tr>
+        <w:tc>
+          <w:tcPr>
+            <w:tcW w:type="dxa" w:w="4320"/>
+          </w:tcPr>
+          <w:p>
+            <w:pPr>
+              <w:jc w:val="center"/>
+            </w:pPr>
+            <w:r>
+              <w:rPr>
+                <w:sz w:val="18"/>
+              </w:rPr>
+              <w:t>generate_report.py</w:t>
+            </w:r>
+          </w:p>
+        </w:tc>
+        <w:tc>
+          <w:tcPr>
+            <w:tcW w:type="dxa" w:w="4320"/>
+          </w:tcPr>
+          <w:p>
+            <w:pPr>
+              <w:jc w:val="center"/>
+            </w:pPr>
+            <w:r>
+              <w:rPr>
+                <w:sz w:val="18"/>
+              </w:rPr>
+              <w:t>Technical report (.docx) generator</w:t>
+            </w:r>
+          </w:p>
+        </w:tc>
+      </w:tr>
+      <w:tr>
+        <w:tc>
+          <w:tcPr>
+            <w:tcW w:type="dxa" w:w="4320"/>
+          </w:tcPr>
+          <w:p>
+            <w:pPr>
+              <w:jc w:val="center"/>
+            </w:pPr>
+            <w:r>
+              <w:rPr>
+                <w:sz w:val="18"/>
+              </w:rPr>
+              <w:t>README.md</w:t>
+            </w:r>
+          </w:p>
+        </w:tc>
+        <w:tc>
+          <w:tcPr>
+            <w:tcW w:type="dxa" w:w="4320"/>
+          </w:tcPr>
+          <w:p>
+            <w:pPr>
+              <w:jc w:val="center"/>
+            </w:pPr>
+            <w:r>
+              <w:rPr>
+                <w:sz w:val="18"/>
+              </w:rPr>
+              <w:t>Project overview and instructions</w:t>
+            </w:r>
+          </w:p>
+        </w:tc>
+      </w:tr>
+    </w:tbl>
+    <w:p/>
+    <w:p>
+      <w:r>
+        <w:rPr>
+          <w:b w:val="0"/>
+          <w:i w:val="0"/>
+          <w:sz w:val="22"/>
+        </w:rPr>
+        <w:t>The API documentation is auto-generated by FastAPI and available at http://localhost:8000/docs when the server is running. This provides an interactive Swagger UI where all endpoints can be tested directly.</w:t>
+      </w:r>
+    </w:p>
+    <w:p>
+      <w:pPr>
+        <w:pStyle w:val="Heading1"/>
+      </w:pPr>
+      <w:r>
+        <w:rPr>
+          <w:color w:val="111111"/>
+        </w:rPr>
+        <w:t>13. How to Run</w:t>
       </w:r>
     </w:p>
     <w:p>
@@ -5146,7 +5564,7 @@
         <w:rPr>
           <w:color w:val="111111"/>
         </w:rPr>
-        <w:t>13. Conclusion</w:t>
+        <w:t>14. Conclusion</w:t>
       </w:r>
     </w:p>
     <w:p>
@@ -5171,6 +5589,8 @@
         <w:br/>
         <w:t>• Interactive dashboard with Chart.js visualisations</w:t>
         <w:br/>
+        <w:t>• Source code deployed on GitHub for public access</w:t>
+        <w:br/>
         <w:t>• Zero-installation standalone mode also available</w:t>
         <w:br/>
         <w:br/>
@@ -5185,7 +5605,7 @@
         <w:rPr>
           <w:color w:val="111111"/>
         </w:rPr>
-        <w:t>14. References</w:t>
+        <w:t>15. References</w:t>
       </w:r>
     </w:p>
     <w:p>
@@ -5236,6 +5656,16 @@
           <w:sz w:val="20"/>
         </w:rPr>
         <w:t>[5] Chart.js Documentation. https://www.chartjs.org/docs/</w:t>
+      </w:r>
+    </w:p>
+    <w:p>
+      <w:r>
+        <w:rPr>
+          <w:b w:val="0"/>
+          <w:i w:val="0"/>
+          <w:sz w:val="20"/>
+        </w:rPr>
+        <w:t>[6] GitHub Repository. https://github.com/hamzahdrill/GROUP-28_COURSE-PROJECT</w:t>
       </w:r>
     </w:p>
     <w:sectPr>

</xml_diff>